<commit_message>
test(backend): anonymize sample template further
</commit_message>
<xml_diff>
--- a/tests/fixtures/Vordruck_sample.docx
+++ b/tests/fixtures/Vordruck_sample.docx
@@ -1,6 +1,6 @@
 
 <file path=word/document.xml><?xml version="1.0" encoding="utf-8"?>
-<w:document xmlns:o="urn:schemas-microsoft-com:office:office" xmlns:r="http://schemas.openxmlformats.org/officeDocument/2006/relationships" xmlns:v="urn:schemas-microsoft-com:vml" xmlns:w="http://schemas.openxmlformats.org/wordprocessingml/2006/main" xmlns:w10="urn:schemas-microsoft-com:office:word" xmlns:wp="http://schemas.openxmlformats.org/drawingml/2006/wordprocessingDrawing" xmlns:wps="http://schemas.microsoft.com/office/word/2010/wordprocessingShape" xmlns:wpg="http://schemas.microsoft.com/office/word/2010/wordprocessingGroup" xmlns:mc="http://schemas.openxmlformats.org/markup-compatibility/2006" xmlns:wp14="http://schemas.microsoft.com/office/word/2010/wordprocessingDrawing" xmlns:w14="http://schemas.microsoft.com/office/word/2010/wordml" mc:Ignorable="w14 wp14">
+<w:document xmlns:o="urn:schemas-microsoft-com:office:office" xmlns:r="http://schemas.openxmlformats.org/officeDocument/2006/relationships" xmlns:v="urn:schemas-microsoft-com:vml" xmlns:w="http://schemas.openxmlformats.org/wordprocessingml/2006/main" xmlns:w10="urn:schemas-microsoft-com:office:word" xmlns:wp="http://schemas.openxmlformats.org/drawingml/2006/wordprocessingDrawing" xmlns:wps="http://schemas.microsoft.com/office/word/2010/wordprocessingShape" xmlns:wpg="http://schemas.microsoft.com/office/word/2010/wordprocessingGroup" xmlns:mc="http://schemas.openxmlformats.org/markup-compatibility/2006" xmlns:wp14="http://schemas.microsoft.com/office/word/2010/wordprocessingDrawing" xmlns:w14="http://schemas.microsoft.com/office/word/2010/wordml" xmlns:w15="http://schemas.microsoft.com/office/word/2012/wordml" mc:Ignorable="w14 wp14 w15">
   <w:body>
     <w:tbl>
       <w:tblPr>
@@ -8,6 +8,7 @@
         <w:tblW w:w="4242" w:type="dxa"/>
         <w:jc w:val="left"/>
         <w:tblInd w:w="0" w:type="dxa"/>
+        <w:tblLayout w:type="fixed"/>
         <w:tblCellMar>
           <w:top w:w="0" w:type="dxa"/>
           <w:left w:w="0" w:type="dxa"/>
@@ -32,7 +33,7 @@
             <w:pPr>
               <w:pStyle w:val="Normal"/>
               <w:spacing w:lineRule="auto" w:line="259"/>
-              <w:ind w:left="34" w:hanging="0"/>
+              <w:ind w:hanging="0" w:left="34"/>
               <w:rPr>
                 <w:sz w:val="20"/>
               </w:rPr>
@@ -201,7 +202,7 @@
           <w:tab w:val="left" w:pos="7088" w:leader="none"/>
         </w:tabs>
         <w:spacing w:lineRule="auto" w:line="259" w:before="120" w:after="0"/>
-        <w:ind w:left="5670" w:hanging="0"/>
+        <w:ind w:hanging="0" w:left="5670"/>
         <w:rPr>
           <w:sz w:val="20"/>
         </w:rPr>
@@ -228,10 +229,11 @@
     </w:p>
     <w:tbl>
       <w:tblPr>
-        <w:tblpPr w:bottomFromText="0" w:horzAnchor="text" w:leftFromText="0" w:rightFromText="0" w:tblpX="0" w:tblpY="2553" w:topFromText="0" w:vertAnchor="page"/>
+        <w:tblpPr w:vertAnchor="page" w:horzAnchor="text" w:tblpX="0" w:tblpY="2553"/>
         <w:tblW w:w="9919" w:type="dxa"/>
         <w:jc w:val="left"/>
         <w:tblInd w:w="0" w:type="dxa"/>
+        <w:tblLayout w:type="fixed"/>
         <w:tblCellMar>
           <w:top w:w="0" w:type="dxa"/>
           <w:left w:w="0" w:type="dxa"/>
@@ -242,8 +244,8 @@
       </w:tblPr>
       <w:tblGrid>
         <w:gridCol w:w="4530"/>
-        <w:gridCol w:w="1130"/>
-        <w:gridCol w:w="4259"/>
+        <w:gridCol w:w="1129"/>
+        <w:gridCol w:w="4260"/>
       </w:tblGrid>
       <w:tr>
         <w:trPr>
@@ -287,13 +289,69 @@
                 <w:sz w:val="16"/>
                 <w:u w:val="single"/>
               </w:rPr>
-              <w:t xml:space="preserve"> · Ernststr. 12 · 53721 Siegburg</w:t>
+              <w:t xml:space="preserve"> · </w:t>
+            </w:r>
+            <w:r>
+              <w:rPr>
+                <w:rFonts w:cs="Arial"/>
+                <w:sz w:val="16"/>
+                <w:u w:val="single"/>
+              </w:rPr>
+              <w:t>Muster</w:t>
+            </w:r>
+            <w:r>
+              <w:rPr>
+                <w:rFonts w:cs="Arial"/>
+                <w:sz w:val="16"/>
+                <w:u w:val="single"/>
+              </w:rPr>
+              <w:t>str. 1</w:t>
+            </w:r>
+            <w:r>
+              <w:rPr>
+                <w:rFonts w:cs="Arial"/>
+                <w:sz w:val="16"/>
+                <w:u w:val="single"/>
+              </w:rPr>
+              <w:t>0</w:t>
+            </w:r>
+            <w:r>
+              <w:rPr>
+                <w:rFonts w:cs="Arial"/>
+                <w:sz w:val="16"/>
+                <w:u w:val="single"/>
+              </w:rPr>
+              <w:t xml:space="preserve"> · </w:t>
+            </w:r>
+            <w:r>
+              <w:rPr>
+                <w:rFonts w:cs="Arial"/>
+                <w:sz w:val="16"/>
+                <w:u w:val="single"/>
+              </w:rPr>
+              <w:t>12345</w:t>
+            </w:r>
+            <w:r>
+              <w:rPr>
+                <w:rFonts w:cs="Arial"/>
+                <w:sz w:val="16"/>
+                <w:u w:val="single"/>
+              </w:rPr>
+              <w:t xml:space="preserve"> </w:t>
+            </w:r>
+            <w:r>
+              <w:rPr>
+                <w:rFonts w:cs="Arial"/>
+                <w:sz w:val="16"/>
+                <w:u w:val="single"/>
+              </w:rPr>
+              <w:t>Musterstadt</w:t>
             </w:r>
           </w:p>
         </w:tc>
         <w:tc>
           <w:tcPr>
-            <w:tcW w:w="1130" w:type="dxa"/>
+            <w:tcW w:w="1129" w:type="dxa"/>
             <w:tcBorders/>
             <w:vAlign w:val="bottom"/>
           </w:tcPr>
@@ -317,7 +375,7 @@
         </w:tc>
         <w:tc>
           <w:tcPr>
-            <w:tcW w:w="4259" w:type="dxa"/>
+            <w:tcW w:w="4260" w:type="dxa"/>
             <w:tcBorders/>
             <w:vAlign w:val="bottom"/>
           </w:tcPr>
@@ -412,7 +470,6 @@
               <w:rPr>
                 <w:rFonts w:ascii="Arial" w:hAnsi="Arial" w:eastAsia="Times New Roman" w:cs="Times New Roman"/>
                 <w:b/>
-                <w:b/>
                 <w:color w:val="auto"/>
                 <w:kern w:val="0"/>
                 <w:sz w:val="20"/>
@@ -523,7 +580,7 @@
         </w:tc>
         <w:tc>
           <w:tcPr>
-            <w:tcW w:w="1130" w:type="dxa"/>
+            <w:tcW w:w="1129" w:type="dxa"/>
             <w:tcBorders/>
           </w:tcPr>
           <w:p>
@@ -546,7 +603,7 @@
         </w:tc>
         <w:tc>
           <w:tcPr>
-            <w:tcW w:w="4259" w:type="dxa"/>
+            <w:tcW w:w="4260" w:type="dxa"/>
             <w:tcBorders/>
           </w:tcPr>
           <w:p>
@@ -721,14 +778,14 @@
                 <w:sz w:val="16"/>
                 <w:szCs w:val="16"/>
               </w:rPr>
-              <w:t xml:space="preserve"> </w:t>
+              <w:t xml:space="preserve"> 56789</w:t>
             </w:r>
             <w:r>
               <w:rPr>
                 <w:sz w:val="16"/>
                 <w:szCs w:val="16"/>
               </w:rPr>
-              <w:t>5678999</w:t>
+              <w:t>012</w:t>
             </w:r>
           </w:p>
           <w:p>
@@ -847,7 +904,7 @@
       <w:pPr>
         <w:pStyle w:val="Normal"/>
         <w:spacing w:lineRule="auto" w:line="259"/>
-        <w:ind w:right="-3" w:hanging="0"/>
+        <w:ind w:hanging="0" w:right="-3"/>
         <w:rPr>
           <w:rFonts w:cs="Arial"/>
           <w:sz w:val="20"/>
@@ -863,10 +920,9 @@
     <w:p>
       <w:pPr>
         <w:pStyle w:val="Normal"/>
-        <w:ind w:right="-3" w:hanging="0"/>
-        <w:rPr>
-          <w:rFonts w:cs="Arial"/>
-          <w:b/>
+        <w:ind w:hanging="0" w:right="-3"/>
+        <w:rPr>
+          <w:rFonts w:cs="Arial"/>
           <w:b/>
           <w:sz w:val="20"/>
         </w:rPr>
@@ -896,7 +952,7 @@
       <w:pPr>
         <w:pStyle w:val="Normal"/>
         <w:spacing w:lineRule="exact" w:line="260"/>
-        <w:ind w:right="-3" w:hanging="0"/>
+        <w:ind w:hanging="0" w:right="-3"/>
         <w:rPr>
           <w:rFonts w:cs="Arial"/>
           <w:sz w:val="20"/>
@@ -913,7 +969,7 @@
       <w:pPr>
         <w:pStyle w:val="Normal"/>
         <w:spacing w:lineRule="exact" w:line="260"/>
-        <w:ind w:right="-3" w:hanging="0"/>
+        <w:ind w:hanging="0" w:right="-3"/>
         <w:rPr>
           <w:rFonts w:cs="Arial"/>
           <w:sz w:val="20"/>
@@ -931,7 +987,7 @@
       <w:pPr>
         <w:pStyle w:val="Normal"/>
         <w:spacing w:lineRule="exact" w:line="260"/>
-        <w:ind w:right="-3" w:hanging="0"/>
+        <w:ind w:hanging="0" w:right="-3"/>
         <w:rPr>
           <w:rFonts w:cs="Arial"/>
           <w:sz w:val="20"/>
@@ -948,7 +1004,7 @@
       <w:pPr>
         <w:pStyle w:val="Normal"/>
         <w:spacing w:lineRule="exact" w:line="260"/>
-        <w:ind w:right="-3" w:hanging="0"/>
+        <w:ind w:hanging="0" w:right="-3"/>
         <w:jc w:val="both"/>
         <w:rPr>
           <w:rFonts w:cs="Arial"/>
@@ -967,7 +1023,7 @@
       <w:pPr>
         <w:pStyle w:val="Normal"/>
         <w:spacing w:lineRule="exact" w:line="260"/>
-        <w:ind w:right="-3" w:hanging="0"/>
+        <w:ind w:hanging="0" w:right="-3"/>
         <w:jc w:val="both"/>
         <w:rPr>
           <w:rFonts w:cs="Arial"/>
@@ -986,6 +1042,7 @@
         <w:tblW w:w="9360" w:type="dxa"/>
         <w:jc w:val="left"/>
         <w:tblInd w:w="0" w:type="dxa"/>
+        <w:tblLayout w:type="fixed"/>
         <w:tblCellMar>
           <w:top w:w="72" w:type="dxa"/>
           <w:left w:w="72" w:type="dxa"/>
@@ -998,8 +1055,8 @@
         <w:gridCol w:w="541"/>
         <w:gridCol w:w="900"/>
         <w:gridCol w:w="5124"/>
-        <w:gridCol w:w="1174"/>
-        <w:gridCol w:w="1621"/>
+        <w:gridCol w:w="1173"/>
+        <w:gridCol w:w="1622"/>
       </w:tblGrid>
       <w:tr>
         <w:trPr>
@@ -1015,7 +1072,7 @@
           <w:p>
             <w:pPr>
               <w:pStyle w:val="Normal"/>
-              <w:overflowPunct w:val="false"/>
+              <w:overflowPunct w:val="true"/>
               <w:jc w:val="left"/>
               <w:textAlignment w:val="auto"/>
               <w:rPr>
@@ -1046,7 +1103,7 @@
           <w:p>
             <w:pPr>
               <w:pStyle w:val="Normal"/>
-              <w:overflowPunct w:val="false"/>
+              <w:overflowPunct w:val="true"/>
               <w:jc w:val="left"/>
               <w:textAlignment w:val="auto"/>
               <w:rPr>
@@ -1077,7 +1134,7 @@
           <w:p>
             <w:pPr>
               <w:pStyle w:val="Normal"/>
-              <w:overflowPunct w:val="false"/>
+              <w:overflowPunct w:val="true"/>
               <w:jc w:val="left"/>
               <w:textAlignment w:val="auto"/>
               <w:rPr>
@@ -1100,7 +1157,7 @@
         </w:tc>
         <w:tc>
           <w:tcPr>
-            <w:tcW w:w="1174" w:type="dxa"/>
+            <w:tcW w:w="1173" w:type="dxa"/>
             <w:tcBorders/>
             <w:shd w:color="000000" w:fill="D0CECE" w:val="clear"/>
             <w:vAlign w:val="bottom"/>
@@ -1108,7 +1165,7 @@
           <w:p>
             <w:pPr>
               <w:pStyle w:val="Normal"/>
-              <w:overflowPunct w:val="false"/>
+              <w:overflowPunct w:val="true"/>
               <w:jc w:val="right"/>
               <w:textAlignment w:val="auto"/>
               <w:rPr/>
@@ -1139,7 +1196,7 @@
         </w:tc>
         <w:tc>
           <w:tcPr>
-            <w:tcW w:w="1621" w:type="dxa"/>
+            <w:tcW w:w="1622" w:type="dxa"/>
             <w:tcBorders/>
             <w:shd w:color="000000" w:fill="D0CECE" w:val="clear"/>
             <w:vAlign w:val="bottom"/>
@@ -1147,7 +1204,7 @@
           <w:p>
             <w:pPr>
               <w:pStyle w:val="Normal"/>
-              <w:overflowPunct w:val="false"/>
+              <w:overflowPunct w:val="true"/>
               <w:jc w:val="right"/>
               <w:textAlignment w:val="auto"/>
               <w:rPr>
@@ -1185,12 +1242,11 @@
           <w:p>
             <w:pPr>
               <w:pStyle w:val="Normal"/>
-              <w:overflowPunct w:val="false"/>
+              <w:overflowPunct w:val="true"/>
               <w:jc w:val="center"/>
               <w:textAlignment w:val="auto"/>
               <w:rPr>
                 <w:rFonts w:ascii="Calibri" w:hAnsi="Calibri" w:cs="Calibri"/>
-                <w:b/>
                 <w:b/>
                 <w:bCs/>
                 <w:color w:val="000000"/>
@@ -1220,12 +1276,11 @@
           <w:p>
             <w:pPr>
               <w:pStyle w:val="Normal"/>
-              <w:overflowPunct w:val="false"/>
+              <w:overflowPunct w:val="true"/>
               <w:jc w:val="center"/>
               <w:textAlignment w:val="auto"/>
               <w:rPr>
                 <w:rFonts w:ascii="Calibri" w:hAnsi="Calibri" w:cs="Calibri"/>
-                <w:b/>
                 <w:b/>
                 <w:bCs/>
                 <w:color w:val="000000"/>
@@ -1258,7 +1313,6 @@
               <w:rPr>
                 <w:rFonts w:ascii="Calibri" w:hAnsi="Calibri" w:cs="Calibri"/>
                 <w:b/>
-                <w:b/>
                 <w:bCs/>
                 <w:color w:val="000000"/>
                 <w:szCs w:val="22"/>
@@ -1277,7 +1331,7 @@
         </w:tc>
         <w:tc>
           <w:tcPr>
-            <w:tcW w:w="1174" w:type="dxa"/>
+            <w:tcW w:w="1173" w:type="dxa"/>
             <w:tcBorders>
               <w:bottom w:val="single" w:sz="4" w:space="0" w:color="000000"/>
             </w:tcBorders>
@@ -1286,12 +1340,11 @@
           <w:p>
             <w:pPr>
               <w:pStyle w:val="Normal"/>
-              <w:overflowPunct w:val="false"/>
+              <w:overflowPunct w:val="true"/>
               <w:jc w:val="right"/>
               <w:textAlignment w:val="auto"/>
               <w:rPr>
                 <w:rFonts w:ascii="Calibri" w:hAnsi="Calibri" w:cs="Calibri"/>
-                <w:b/>
                 <w:b/>
                 <w:bCs/>
                 <w:color w:val="000000"/>
@@ -1311,7 +1364,7 @@
         </w:tc>
         <w:tc>
           <w:tcPr>
-            <w:tcW w:w="1621" w:type="dxa"/>
+            <w:tcW w:w="1622" w:type="dxa"/>
             <w:tcBorders>
               <w:bottom w:val="single" w:sz="4" w:space="0" w:color="000000"/>
             </w:tcBorders>
@@ -1321,12 +1374,11 @@
           <w:p>
             <w:pPr>
               <w:pStyle w:val="Normal"/>
-              <w:overflowPunct w:val="false"/>
+              <w:overflowPunct w:val="true"/>
               <w:jc w:val="right"/>
               <w:textAlignment w:val="auto"/>
               <w:rPr>
                 <w:rFonts w:ascii="Calibri" w:hAnsi="Calibri" w:cs="Calibri"/>
-                <w:b/>
                 <w:b/>
                 <w:bCs/>
                 <w:color w:val="000000"/>
@@ -1362,7 +1414,7 @@
           <w:p>
             <w:pPr>
               <w:pStyle w:val="Normal"/>
-              <w:overflowPunct w:val="false"/>
+              <w:overflowPunct w:val="true"/>
               <w:textAlignment w:val="auto"/>
               <w:rPr>
                 <w:sz w:val="20"/>
@@ -1394,7 +1446,7 @@
           <w:p>
             <w:pPr>
               <w:pStyle w:val="Normal"/>
-              <w:overflowPunct w:val="false"/>
+              <w:overflowPunct w:val="true"/>
               <w:textAlignment w:val="auto"/>
               <w:rPr>
                 <w:rFonts w:ascii="Calibri" w:hAnsi="Calibri" w:cs="Calibri"/>
@@ -1413,7 +1465,7 @@
         </w:tc>
         <w:tc>
           <w:tcPr>
-            <w:tcW w:w="1174" w:type="dxa"/>
+            <w:tcW w:w="1173" w:type="dxa"/>
             <w:tcBorders>
               <w:top w:val="single" w:sz="4" w:space="0" w:color="000000"/>
             </w:tcBorders>
@@ -1422,7 +1474,7 @@
           <w:p>
             <w:pPr>
               <w:pStyle w:val="Normal"/>
-              <w:overflowPunct w:val="false"/>
+              <w:overflowPunct w:val="true"/>
               <w:jc w:val="right"/>
               <w:textAlignment w:val="auto"/>
               <w:rPr>
@@ -1442,7 +1494,7 @@
         </w:tc>
         <w:tc>
           <w:tcPr>
-            <w:tcW w:w="1621" w:type="dxa"/>
+            <w:tcW w:w="1622" w:type="dxa"/>
             <w:tcBorders>
               <w:top w:val="single" w:sz="4" w:space="0" w:color="000000"/>
             </w:tcBorders>
@@ -1452,7 +1504,7 @@
           <w:p>
             <w:pPr>
               <w:pStyle w:val="Normal"/>
-              <w:overflowPunct w:val="false"/>
+              <w:overflowPunct w:val="true"/>
               <w:jc w:val="right"/>
               <w:textAlignment w:val="auto"/>
               <w:rPr>
@@ -1489,7 +1541,7 @@
           <w:p>
             <w:pPr>
               <w:pStyle w:val="Normal"/>
-              <w:overflowPunct w:val="false"/>
+              <w:overflowPunct w:val="true"/>
               <w:textAlignment w:val="auto"/>
               <w:rPr>
                 <w:sz w:val="20"/>
@@ -1511,14 +1563,14 @@
         </w:tc>
         <w:tc>
           <w:tcPr>
-            <w:tcW w:w="1174" w:type="dxa"/>
+            <w:tcW w:w="1173" w:type="dxa"/>
             <w:tcBorders/>
             <w:vAlign w:val="bottom"/>
           </w:tcPr>
           <w:p>
             <w:pPr>
               <w:pStyle w:val="Normal"/>
-              <w:overflowPunct w:val="false"/>
+              <w:overflowPunct w:val="true"/>
               <w:jc w:val="right"/>
               <w:textAlignment w:val="auto"/>
               <w:rPr>
@@ -1538,7 +1590,7 @@
         </w:tc>
         <w:tc>
           <w:tcPr>
-            <w:tcW w:w="1621" w:type="dxa"/>
+            <w:tcW w:w="1622" w:type="dxa"/>
             <w:tcBorders/>
             <w:shd w:color="auto" w:fill="auto" w:val="clear"/>
             <w:vAlign w:val="bottom"/>
@@ -1546,7 +1598,7 @@
           <w:p>
             <w:pPr>
               <w:pStyle w:val="Normal"/>
-              <w:overflowPunct w:val="false"/>
+              <w:overflowPunct w:val="true"/>
               <w:jc w:val="right"/>
               <w:textAlignment w:val="auto"/>
               <w:rPr>
@@ -1583,7 +1635,7 @@
           <w:p>
             <w:pPr>
               <w:pStyle w:val="Normal"/>
-              <w:overflowPunct w:val="false"/>
+              <w:overflowPunct w:val="true"/>
               <w:textAlignment w:val="auto"/>
               <w:rPr>
                 <w:sz w:val="20"/>
@@ -1606,7 +1658,7 @@
         </w:tc>
         <w:tc>
           <w:tcPr>
-            <w:tcW w:w="1174" w:type="dxa"/>
+            <w:tcW w:w="1173" w:type="dxa"/>
             <w:tcBorders/>
             <w:shd w:color="000000" w:fill="D0CECE" w:val="clear"/>
             <w:vAlign w:val="bottom"/>
@@ -1614,12 +1666,11 @@
           <w:p>
             <w:pPr>
               <w:pStyle w:val="Normal"/>
-              <w:overflowPunct w:val="false"/>
+              <w:overflowPunct w:val="true"/>
               <w:jc w:val="right"/>
               <w:textAlignment w:val="auto"/>
               <w:rPr>
                 <w:rFonts w:ascii="Calibri" w:hAnsi="Calibri" w:cs="Calibri"/>
-                <w:b/>
                 <w:b/>
                 <w:bCs/>
                 <w:color w:val="000000"/>
@@ -1639,7 +1690,7 @@
         </w:tc>
         <w:tc>
           <w:tcPr>
-            <w:tcW w:w="1621" w:type="dxa"/>
+            <w:tcW w:w="1622" w:type="dxa"/>
             <w:tcBorders/>
             <w:shd w:color="000000" w:fill="D0CECE" w:val="clear"/>
             <w:vAlign w:val="bottom"/>
@@ -1647,7 +1698,7 @@
           <w:p>
             <w:pPr>
               <w:pStyle w:val="Normal"/>
-              <w:overflowPunct w:val="false"/>
+              <w:overflowPunct w:val="true"/>
               <w:jc w:val="right"/>
               <w:textAlignment w:val="auto"/>
               <w:rPr>
@@ -1675,7 +1726,7 @@
       <w:pPr>
         <w:pStyle w:val="Normal"/>
         <w:spacing w:lineRule="exact" w:line="260"/>
-        <w:ind w:right="-6" w:hanging="0"/>
+        <w:ind w:hanging="0" w:right="-6"/>
         <w:jc w:val="right"/>
         <w:rPr>
           <w:rFonts w:cs="Arial"/>
@@ -1696,7 +1747,7 @@
       <w:pPr>
         <w:pStyle w:val="Normal"/>
         <w:spacing w:lineRule="exact" w:line="260"/>
-        <w:ind w:right="-6" w:hanging="0"/>
+        <w:ind w:hanging="0" w:right="-6"/>
         <w:rPr>
           <w:rFonts w:cs="Arial"/>
           <w:sz w:val="20"/>
@@ -1732,7 +1783,7 @@
       <w:pPr>
         <w:pStyle w:val="Normal"/>
         <w:spacing w:lineRule="exact" w:line="260"/>
-        <w:ind w:right="-6" w:hanging="0"/>
+        <w:ind w:hanging="0" w:right="-6"/>
         <w:rPr>
           <w:rFonts w:cs="Arial"/>
           <w:sz w:val="20"/>
@@ -1749,7 +1800,7 @@
       <w:pPr>
         <w:pStyle w:val="Normal"/>
         <w:spacing w:lineRule="exact" w:line="260"/>
-        <w:ind w:right="-6" w:hanging="0"/>
+        <w:ind w:hanging="0" w:right="-6"/>
         <w:rPr>
           <w:rFonts w:cs="Arial"/>
           <w:sz w:val="20"/>
@@ -1767,7 +1818,7 @@
       <w:pPr>
         <w:pStyle w:val="Normal"/>
         <w:spacing w:lineRule="exact" w:line="260"/>
-        <w:ind w:right="-6" w:hanging="0"/>
+        <w:ind w:hanging="0" w:right="-6"/>
         <w:rPr>
           <w:rFonts w:cs="Arial"/>
           <w:sz w:val="20"/>
@@ -1784,7 +1835,7 @@
       <w:pPr>
         <w:pStyle w:val="Normal"/>
         <w:spacing w:lineRule="exact" w:line="260"/>
-        <w:ind w:right="-6" w:hanging="0"/>
+        <w:ind w:hanging="0" w:right="-6"/>
         <w:rPr>
           <w:rFonts w:cs="Arial"/>
           <w:sz w:val="20"/>
@@ -1801,7 +1852,7 @@
       <w:pPr>
         <w:pStyle w:val="Normal"/>
         <w:spacing w:lineRule="exact" w:line="260"/>
-        <w:ind w:right="-6" w:hanging="0"/>
+        <w:ind w:hanging="0" w:right="-6"/>
         <w:rPr>
           <w:rFonts w:cs="Arial"/>
           <w:sz w:val="20"/>
@@ -1819,7 +1870,7 @@
       <w:pPr>
         <w:pStyle w:val="Normal"/>
         <w:spacing w:lineRule="exact" w:line="260"/>
-        <w:ind w:right="-3" w:hanging="0"/>
+        <w:ind w:hanging="0" w:right="-3"/>
         <w:rPr>
           <w:rFonts w:cs="Arial"/>
           <w:sz w:val="20"/>
@@ -1836,7 +1887,7 @@
       <w:pPr>
         <w:pStyle w:val="Normal"/>
         <w:spacing w:lineRule="exact" w:line="260"/>
-        <w:ind w:right="-3" w:hanging="0"/>
+        <w:ind w:hanging="0" w:right="-3"/>
         <w:rPr>
           <w:rFonts w:cs="Arial"/>
           <w:i/>
@@ -1859,7 +1910,7 @@
       <w:pPr>
         <w:pStyle w:val="Normal"/>
         <w:spacing w:lineRule="exact" w:line="260"/>
-        <w:ind w:right="-3" w:hanging="0"/>
+        <w:ind w:hanging="0" w:right="-3"/>
         <w:rPr>
           <w:rFonts w:cs="Arial"/>
           <w:sz w:val="20"/>
@@ -1876,7 +1927,7 @@
       <w:pPr>
         <w:pStyle w:val="Normal"/>
         <w:spacing w:lineRule="exact" w:line="260"/>
-        <w:ind w:right="-3" w:hanging="0"/>
+        <w:ind w:hanging="0" w:right="-3"/>
         <w:rPr>
           <w:rFonts w:cs="Arial"/>
           <w:sz w:val="20"/>
@@ -1894,7 +1945,7 @@
       <w:pPr>
         <w:pStyle w:val="Normal"/>
         <w:spacing w:lineRule="exact" w:line="260"/>
-        <w:ind w:right="-3" w:hanging="0"/>
+        <w:ind w:hanging="0" w:right="-3"/>
         <w:rPr>
           <w:rFonts w:cs="Arial"/>
           <w:sz w:val="16"/>
@@ -1914,22 +1965,29 @@
       <w:pPr>
         <w:pStyle w:val="Normal"/>
         <w:spacing w:lineRule="exact" w:line="260"/>
-        <w:ind w:right="-3" w:hanging="0"/>
+        <w:ind w:hanging="0" w:right="-3"/>
         <w:rPr>
           <w:rFonts w:cs="Arial"/>
           <w:sz w:val="20"/>
         </w:rPr>
       </w:pPr>
       <w:r>
-        <w:rPr/>
+        <w:rPr>
+          <w:rFonts w:cs="Arial"/>
+          <w:sz w:val="20"/>
+        </w:rPr>
       </w:r>
     </w:p>
     <w:sectPr>
-      <w:headerReference w:type="default" r:id="rId3"/>
-      <w:footerReference w:type="default" r:id="rId4"/>
+      <w:headerReference w:type="even" r:id="rId3"/>
+      <w:headerReference w:type="default" r:id="rId4"/>
+      <w:headerReference w:type="first" r:id="rId5"/>
+      <w:footerReference w:type="even" r:id="rId6"/>
+      <w:footerReference w:type="default" r:id="rId7"/>
+      <w:footerReference w:type="first" r:id="rId8"/>
       <w:type w:val="nextPage"/>
       <w:pgSz w:w="11906" w:h="16838"/>
-      <w:pgMar w:left="1418" w:right="1134" w:header="283" w:top="567" w:footer="680" w:bottom="1985" w:gutter="0"/>
+      <w:pgMar w:left="1418" w:right="1134" w:gutter="0" w:header="283" w:top="567" w:footer="680" w:bottom="1985"/>
       <w:pgNumType w:start="1" w:fmt="decimal"/>
       <w:formProt w:val="false"/>
       <w:textDirection w:val="lrTb"/>
@@ -1940,7 +1998,21 @@
 </file>
 
 <file path=word/footer1.xml><?xml version="1.0" encoding="utf-8"?>
-<w:ftr xmlns:o="urn:schemas-microsoft-com:office:office" xmlns:r="http://schemas.openxmlformats.org/officeDocument/2006/relationships" xmlns:v="urn:schemas-microsoft-com:vml" xmlns:w="http://schemas.openxmlformats.org/wordprocessingml/2006/main" xmlns:w10="urn:schemas-microsoft-com:office:word" xmlns:wp="http://schemas.openxmlformats.org/drawingml/2006/wordprocessingDrawing" xmlns:wps="http://schemas.microsoft.com/office/word/2010/wordprocessingShape" xmlns:wpg="http://schemas.microsoft.com/office/word/2010/wordprocessingGroup" xmlns:mc="http://schemas.openxmlformats.org/markup-compatibility/2006" xmlns:wp14="http://schemas.microsoft.com/office/word/2010/wordprocessingDrawing" xmlns:w14="http://schemas.microsoft.com/office/word/2010/wordml" mc:Ignorable="w14 wp14">
+<w:ftr xmlns:o="urn:schemas-microsoft-com:office:office" xmlns:r="http://schemas.openxmlformats.org/officeDocument/2006/relationships" xmlns:v="urn:schemas-microsoft-com:vml" xmlns:w="http://schemas.openxmlformats.org/wordprocessingml/2006/main" xmlns:w10="urn:schemas-microsoft-com:office:word" xmlns:wp="http://schemas.openxmlformats.org/drawingml/2006/wordprocessingDrawing" xmlns:wps="http://schemas.microsoft.com/office/word/2010/wordprocessingShape" xmlns:wpg="http://schemas.microsoft.com/office/word/2010/wordprocessingGroup" xmlns:mc="http://schemas.openxmlformats.org/markup-compatibility/2006" xmlns:wp14="http://schemas.microsoft.com/office/word/2010/wordprocessingDrawing" xmlns:w14="http://schemas.microsoft.com/office/word/2010/wordml" xmlns:w15="http://schemas.microsoft.com/office/word/2012/wordml" mc:Ignorable="w14 wp14 w15">
+  <w:p>
+    <w:pPr>
+      <w:pStyle w:val="Footer"/>
+      <w:rPr/>
+    </w:pPr>
+    <w:r>
+      <w:rPr/>
+    </w:r>
+  </w:p>
+</w:ftr>
+</file>
+
+<file path=word/footer2.xml><?xml version="1.0" encoding="utf-8"?>
+<w:ftr xmlns:o="urn:schemas-microsoft-com:office:office" xmlns:r="http://schemas.openxmlformats.org/officeDocument/2006/relationships" xmlns:v="urn:schemas-microsoft-com:vml" xmlns:w="http://schemas.openxmlformats.org/wordprocessingml/2006/main" xmlns:w10="urn:schemas-microsoft-com:office:word" xmlns:wp="http://schemas.openxmlformats.org/drawingml/2006/wordprocessingDrawing" xmlns:wps="http://schemas.microsoft.com/office/word/2010/wordprocessingShape" xmlns:wpg="http://schemas.microsoft.com/office/word/2010/wordprocessingGroup" xmlns:mc="http://schemas.openxmlformats.org/markup-compatibility/2006" xmlns:wp14="http://schemas.microsoft.com/office/word/2010/wordprocessingDrawing" xmlns:w14="http://schemas.microsoft.com/office/word/2010/wordml" xmlns:w15="http://schemas.microsoft.com/office/word/2012/wordml" mc:Ignorable="w14 wp14 w15">
   <w:p>
     <w:pPr>
       <w:pStyle w:val="Normal"/>
@@ -1966,7 +2038,7 @@
       <w:rPr>
         <w:sz w:val="16"/>
       </w:rPr>
-      <w:instrText> PAGE </w:instrText>
+      <w:instrText xml:space="preserve"> PAGE </w:instrText>
     </w:r>
     <w:r>
       <w:rPr>
@@ -2002,7 +2074,7 @@
       <w:rPr>
         <w:sz w:val="16"/>
       </w:rPr>
-      <w:instrText> NUMPAGES </w:instrText>
+      <w:instrText xml:space="preserve"> NUMPAGES </w:instrText>
     </w:r>
     <w:r>
       <w:rPr>
@@ -2028,6 +2100,7 @@
       <w:tblW w:w="9355" w:type="dxa"/>
       <w:jc w:val="left"/>
       <w:tblInd w:w="0" w:type="dxa"/>
+      <w:tblLayout w:type="fixed"/>
       <w:tblCellMar>
         <w:top w:w="113" w:type="dxa"/>
         <w:left w:w="0" w:type="dxa"/>
@@ -2064,9 +2137,24 @@
             </w:rPr>
             <w:t>Heinrich Metallbau</w:t>
             <w:br/>
-            <w:t>Ernststr. 12</w:t>
+          </w:r>
+          <w:r>
+            <w:rPr>
+              <w:sz w:val="16"/>
+            </w:rPr>
+            <w:t>Musterstr. 10</w:t>
+          </w:r>
+          <w:r>
+            <w:rPr>
+              <w:sz w:val="16"/>
+            </w:rPr>
             <w:br/>
-            <w:t>53721 Siegburg</w:t>
+          </w:r>
+          <w:r>
+            <w:rPr>
+              <w:sz w:val="16"/>
+            </w:rPr>
+            <w:t>12345 Musterstadt</w:t>
           </w:r>
         </w:p>
       </w:tc>
@@ -2082,7 +2170,6 @@
             <w:pStyle w:val="Footer"/>
             <w:rPr>
               <w:b/>
-              <w:b/>
               <w:sz w:val="16"/>
             </w:rPr>
           </w:pPr>
@@ -2116,14 +2203,24 @@
               <w:szCs w:val="20"/>
               <w:lang w:val="de-DE" w:eastAsia="de-DE" w:bidi="ar-SA"/>
             </w:rPr>
-            <w:t>234 5678999</w:t>
+            <w:t>234 5678</w:t>
+          </w:r>
+          <w:r>
+            <w:rPr>
+              <w:rFonts w:eastAsia="Times New Roman" w:cs="Times New Roman"/>
+              <w:color w:val="auto"/>
+              <w:kern w:val="0"/>
+              <w:sz w:val="16"/>
+              <w:szCs w:val="20"/>
+              <w:lang w:val="de-DE" w:eastAsia="de-DE" w:bidi="ar-SA"/>
+            </w:rPr>
+            <w:t>9012</w:t>
           </w:r>
         </w:p>
         <w:p>
           <w:pPr>
             <w:pStyle w:val="Footer"/>
             <w:rPr>
-              <w:b/>
               <w:b/>
               <w:sz w:val="16"/>
             </w:rPr>
@@ -2253,37 +2350,406 @@
             <w:rPr>
               <w:sz w:val="16"/>
             </w:rPr>
-            <w:t xml:space="preserve">SteuerNr.: </w:t>
+            <w:t>SteuerNr.: 000/0000/0000</w:t>
+          </w:r>
+        </w:p>
+        <w:p>
+          <w:pPr>
+            <w:pStyle w:val="Footer"/>
+            <w:rPr>
+              <w:sz w:val="16"/>
+            </w:rPr>
+          </w:pPr>
+          <w:r>
+            <w:rPr>
+              <w:sz w:val="16"/>
+            </w:rPr>
+            <w:t>USt.-ID: DE</w:t>
           </w:r>
           <w:r>
             <w:rPr>
-              <w:sz w:val="16"/>
-            </w:rPr>
-            <w:t>000</w:t>
+              <w:rFonts w:eastAsia="Times New Roman" w:cs="Times New Roman"/>
+              <w:color w:val="auto"/>
+              <w:kern w:val="0"/>
+              <w:sz w:val="16"/>
+              <w:szCs w:val="20"/>
+              <w:lang w:val="de-DE" w:eastAsia="de-DE" w:bidi="ar-SA"/>
+            </w:rPr>
+            <w:t>000000000</w:t>
+          </w:r>
+        </w:p>
+        <w:p>
+          <w:pPr>
+            <w:pStyle w:val="Footer"/>
+            <w:rPr>
+              <w:sz w:val="16"/>
+            </w:rPr>
+          </w:pPr>
+          <w:r>
+            <w:rPr>
+              <w:sz w:val="16"/>
+            </w:rPr>
+          </w:r>
+        </w:p>
+      </w:tc>
+    </w:tr>
+  </w:tbl>
+  <w:p>
+    <w:pPr>
+      <w:pStyle w:val="Footer"/>
+      <w:rPr>
+        <w:sz w:val="2"/>
+      </w:rPr>
+    </w:pPr>
+    <w:r>
+      <w:rPr>
+        <w:sz w:val="2"/>
+      </w:rPr>
+    </w:r>
+  </w:p>
+</w:ftr>
+</file>
+
+<file path=word/footer3.xml><?xml version="1.0" encoding="utf-8"?>
+<w:ftr xmlns:o="urn:schemas-microsoft-com:office:office" xmlns:r="http://schemas.openxmlformats.org/officeDocument/2006/relationships" xmlns:v="urn:schemas-microsoft-com:vml" xmlns:w="http://schemas.openxmlformats.org/wordprocessingml/2006/main" xmlns:w10="urn:schemas-microsoft-com:office:word" xmlns:wp="http://schemas.openxmlformats.org/drawingml/2006/wordprocessingDrawing" xmlns:wps="http://schemas.microsoft.com/office/word/2010/wordprocessingShape" xmlns:wpg="http://schemas.microsoft.com/office/word/2010/wordprocessingGroup" xmlns:mc="http://schemas.openxmlformats.org/markup-compatibility/2006" xmlns:wp14="http://schemas.microsoft.com/office/word/2010/wordprocessingDrawing" xmlns:w14="http://schemas.microsoft.com/office/word/2010/wordml" xmlns:w15="http://schemas.microsoft.com/office/word/2012/wordml" mc:Ignorable="w14 wp14 w15">
+  <w:p>
+    <w:pPr>
+      <w:pStyle w:val="Normal"/>
+      <w:spacing w:before="240" w:after="240"/>
+      <w:jc w:val="right"/>
+      <w:rPr>
+        <w:sz w:val="16"/>
+      </w:rPr>
+    </w:pPr>
+    <w:r>
+      <w:rPr>
+        <w:sz w:val="16"/>
+      </w:rPr>
+      <w:t xml:space="preserve">Seiten </w:t>
+    </w:r>
+    <w:r>
+      <w:rPr>
+        <w:sz w:val="16"/>
+      </w:rPr>
+      <w:fldChar w:fldCharType="begin"/>
+    </w:r>
+    <w:r>
+      <w:rPr>
+        <w:sz w:val="16"/>
+      </w:rPr>
+      <w:instrText xml:space="preserve"> PAGE </w:instrText>
+    </w:r>
+    <w:r>
+      <w:rPr>
+        <w:sz w:val="16"/>
+      </w:rPr>
+      <w:fldChar w:fldCharType="separate"/>
+    </w:r>
+    <w:r>
+      <w:rPr>
+        <w:sz w:val="16"/>
+      </w:rPr>
+      <w:t>1</w:t>
+    </w:r>
+    <w:r>
+      <w:rPr>
+        <w:sz w:val="16"/>
+      </w:rPr>
+      <w:fldChar w:fldCharType="end"/>
+    </w:r>
+    <w:r>
+      <w:rPr>
+        <w:sz w:val="16"/>
+      </w:rPr>
+      <w:t xml:space="preserve"> von </w:t>
+    </w:r>
+    <w:r>
+      <w:rPr>
+        <w:sz w:val="16"/>
+      </w:rPr>
+      <w:fldChar w:fldCharType="begin"/>
+    </w:r>
+    <w:r>
+      <w:rPr>
+        <w:sz w:val="16"/>
+      </w:rPr>
+      <w:instrText xml:space="preserve"> NUMPAGES </w:instrText>
+    </w:r>
+    <w:r>
+      <w:rPr>
+        <w:sz w:val="16"/>
+      </w:rPr>
+      <w:fldChar w:fldCharType="separate"/>
+    </w:r>
+    <w:r>
+      <w:rPr>
+        <w:sz w:val="16"/>
+      </w:rPr>
+      <w:t>1</w:t>
+    </w:r>
+    <w:r>
+      <w:rPr>
+        <w:sz w:val="16"/>
+      </w:rPr>
+      <w:fldChar w:fldCharType="end"/>
+    </w:r>
+  </w:p>
+  <w:tbl>
+    <w:tblPr>
+      <w:tblW w:w="9355" w:type="dxa"/>
+      <w:jc w:val="left"/>
+      <w:tblInd w:w="0" w:type="dxa"/>
+      <w:tblLayout w:type="fixed"/>
+      <w:tblCellMar>
+        <w:top w:w="113" w:type="dxa"/>
+        <w:left w:w="0" w:type="dxa"/>
+        <w:bottom w:w="0" w:type="dxa"/>
+        <w:right w:w="0" w:type="dxa"/>
+      </w:tblCellMar>
+      <w:tblLook w:val="04a0" w:noHBand="0" w:noVBand="1" w:firstColumn="1" w:lastRow="0" w:lastColumn="0" w:firstRow="1"/>
+    </w:tblPr>
+    <w:tblGrid>
+      <w:gridCol w:w="2326"/>
+      <w:gridCol w:w="2369"/>
+      <w:gridCol w:w="2362"/>
+      <w:gridCol w:w="2297"/>
+    </w:tblGrid>
+    <w:tr>
+      <w:trPr/>
+      <w:tc>
+        <w:tcPr>
+          <w:tcW w:w="2326" w:type="dxa"/>
+          <w:tcBorders>
+            <w:top w:val="single" w:sz="4" w:space="0" w:color="000000"/>
+          </w:tcBorders>
+        </w:tcPr>
+        <w:p>
+          <w:pPr>
+            <w:pStyle w:val="Footer"/>
+            <w:rPr>
+              <w:sz w:val="16"/>
+            </w:rPr>
+          </w:pPr>
+          <w:r>
+            <w:rPr>
+              <w:sz w:val="16"/>
+            </w:rPr>
+            <w:t>Heinrich Metallbau</w:t>
+            <w:br/>
           </w:r>
           <w:r>
             <w:rPr>
               <w:sz w:val="16"/>
             </w:rPr>
-            <w:t>/</w:t>
+            <w:t>Musterstr. 10</w:t>
           </w:r>
           <w:r>
             <w:rPr>
               <w:sz w:val="16"/>
             </w:rPr>
-            <w:t>0000</w:t>
+            <w:br/>
           </w:r>
           <w:r>
             <w:rPr>
               <w:sz w:val="16"/>
             </w:rPr>
-            <w:t>/</w:t>
+            <w:t>12345 Musterstadt</w:t>
+          </w:r>
+        </w:p>
+      </w:tc>
+      <w:tc>
+        <w:tcPr>
+          <w:tcW w:w="2369" w:type="dxa"/>
+          <w:tcBorders>
+            <w:top w:val="single" w:sz="4" w:space="0" w:color="000000"/>
+          </w:tcBorders>
+        </w:tcPr>
+        <w:p>
+          <w:pPr>
+            <w:pStyle w:val="Footer"/>
+            <w:rPr>
+              <w:b/>
+              <w:sz w:val="16"/>
+            </w:rPr>
+          </w:pPr>
+          <w:r>
+            <w:rPr>
+              <w:b/>
+              <w:sz w:val="16"/>
+            </w:rPr>
+            <w:t>Telefon:</w:t>
+          </w:r>
+        </w:p>
+        <w:p>
+          <w:pPr>
+            <w:pStyle w:val="Footer"/>
+            <w:rPr>
+              <w:sz w:val="16"/>
+            </w:rPr>
+          </w:pPr>
+          <w:r>
+            <w:rPr>
+              <w:sz w:val="16"/>
+            </w:rPr>
+            <w:t>01</w:t>
           </w:r>
           <w:r>
             <w:rPr>
-              <w:sz w:val="16"/>
-            </w:rPr>
-            <w:t>0000</w:t>
+              <w:rFonts w:eastAsia="Times New Roman" w:cs="Times New Roman"/>
+              <w:color w:val="auto"/>
+              <w:kern w:val="0"/>
+              <w:sz w:val="16"/>
+              <w:szCs w:val="20"/>
+              <w:lang w:val="de-DE" w:eastAsia="de-DE" w:bidi="ar-SA"/>
+            </w:rPr>
+            <w:t>234 5678</w:t>
+          </w:r>
+          <w:r>
+            <w:rPr>
+              <w:rFonts w:eastAsia="Times New Roman" w:cs="Times New Roman"/>
+              <w:color w:val="auto"/>
+              <w:kern w:val="0"/>
+              <w:sz w:val="16"/>
+              <w:szCs w:val="20"/>
+              <w:lang w:val="de-DE" w:eastAsia="de-DE" w:bidi="ar-SA"/>
+            </w:rPr>
+            <w:t>9012</w:t>
+          </w:r>
+        </w:p>
+        <w:p>
+          <w:pPr>
+            <w:pStyle w:val="Footer"/>
+            <w:rPr>
+              <w:b/>
+              <w:sz w:val="16"/>
+            </w:rPr>
+          </w:pPr>
+          <w:r>
+            <w:rPr>
+              <w:b/>
+              <w:sz w:val="16"/>
+            </w:rPr>
+            <w:t>Mail:</w:t>
+          </w:r>
+        </w:p>
+        <w:p>
+          <w:pPr>
+            <w:pStyle w:val="Footer"/>
+            <w:rPr>
+              <w:sz w:val="16"/>
+            </w:rPr>
+          </w:pPr>
+          <w:r>
+            <w:rPr>
+              <w:sz w:val="16"/>
+            </w:rPr>
+            <w:t>muster@email.de</w:t>
+          </w:r>
+        </w:p>
+      </w:tc>
+      <w:tc>
+        <w:tcPr>
+          <w:tcW w:w="2362" w:type="dxa"/>
+          <w:tcBorders>
+            <w:top w:val="single" w:sz="4" w:space="0" w:color="000000"/>
+          </w:tcBorders>
+        </w:tcPr>
+        <w:p>
+          <w:pPr>
+            <w:pStyle w:val="Footer"/>
+            <w:rPr>
+              <w:sz w:val="16"/>
+            </w:rPr>
+          </w:pPr>
+          <w:r>
+            <w:rPr>
+              <w:rFonts w:eastAsia="Times New Roman" w:cs="Times New Roman"/>
+              <w:color w:val="auto"/>
+              <w:kern w:val="0"/>
+              <w:sz w:val="16"/>
+              <w:szCs w:val="20"/>
+              <w:lang w:val="de-DE" w:eastAsia="de-DE" w:bidi="ar-SA"/>
+            </w:rPr>
+            <w:t>Musterbank</w:t>
+          </w:r>
+          <w:r>
+            <w:rPr>
+              <w:sz w:val="16"/>
+            </w:rPr>
+            <w:br/>
+            <w:t xml:space="preserve">BIC: </w:t>
+          </w:r>
+          <w:r>
+            <w:rPr>
+              <w:rFonts w:eastAsia="Times New Roman" w:cs="Times New Roman"/>
+              <w:color w:val="auto"/>
+              <w:kern w:val="0"/>
+              <w:sz w:val="16"/>
+              <w:szCs w:val="20"/>
+              <w:lang w:val="de-DE" w:eastAsia="de-DE" w:bidi="ar-SA"/>
+            </w:rPr>
+            <w:t>ABCDEF00</w:t>
+          </w:r>
+        </w:p>
+        <w:p>
+          <w:pPr>
+            <w:pStyle w:val="Footer"/>
+            <w:rPr>
+              <w:sz w:val="16"/>
+            </w:rPr>
+          </w:pPr>
+          <w:r>
+            <w:rPr>
+              <w:sz w:val="16"/>
+            </w:rPr>
+            <w:t>IBAN:</w:t>
+          </w:r>
+        </w:p>
+        <w:p>
+          <w:pPr>
+            <w:pStyle w:val="Footer"/>
+            <w:rPr>
+              <w:sz w:val="16"/>
+            </w:rPr>
+          </w:pPr>
+          <w:r>
+            <w:rPr>
+              <w:sz w:val="16"/>
+            </w:rPr>
+            <w:t>DE</w:t>
+          </w:r>
+          <w:r>
+            <w:rPr>
+              <w:rFonts w:eastAsia="Times New Roman" w:cs="Times New Roman"/>
+              <w:color w:val="auto"/>
+              <w:kern w:val="0"/>
+              <w:sz w:val="16"/>
+              <w:szCs w:val="20"/>
+              <w:lang w:val="de-DE" w:eastAsia="de-DE" w:bidi="ar-SA"/>
+            </w:rPr>
+            <w:t>0000000000000000</w:t>
+          </w:r>
+        </w:p>
+      </w:tc>
+      <w:tc>
+        <w:tcPr>
+          <w:tcW w:w="2297" w:type="dxa"/>
+          <w:tcBorders>
+            <w:top w:val="single" w:sz="4" w:space="0" w:color="000000"/>
+          </w:tcBorders>
+        </w:tcPr>
+        <w:p>
+          <w:pPr>
+            <w:pStyle w:val="Footer"/>
+            <w:rPr>
+              <w:sz w:val="16"/>
+            </w:rPr>
+          </w:pPr>
+          <w:r>
+            <w:rPr>
+              <w:sz w:val="16"/>
+            </w:rPr>
+            <w:t>SteuerNr.: 000/0000/0000</w:t>
           </w:r>
         </w:p>
         <w:p>
@@ -2344,7 +2810,21 @@
 </file>
 
 <file path=word/header1.xml><?xml version="1.0" encoding="utf-8"?>
-<w:hdr xmlns:o="urn:schemas-microsoft-com:office:office" xmlns:r="http://schemas.openxmlformats.org/officeDocument/2006/relationships" xmlns:v="urn:schemas-microsoft-com:vml" xmlns:w="http://schemas.openxmlformats.org/wordprocessingml/2006/main" xmlns:w10="urn:schemas-microsoft-com:office:word" xmlns:wp="http://schemas.openxmlformats.org/drawingml/2006/wordprocessingDrawing" xmlns:wps="http://schemas.microsoft.com/office/word/2010/wordprocessingShape" xmlns:wpg="http://schemas.microsoft.com/office/word/2010/wordprocessingGroup" xmlns:mc="http://schemas.openxmlformats.org/markup-compatibility/2006" xmlns:wp14="http://schemas.microsoft.com/office/word/2010/wordprocessingDrawing" xmlns:w14="http://schemas.microsoft.com/office/word/2010/wordml" mc:Ignorable="w14 wp14">
+<w:hdr xmlns:o="urn:schemas-microsoft-com:office:office" xmlns:r="http://schemas.openxmlformats.org/officeDocument/2006/relationships" xmlns:v="urn:schemas-microsoft-com:vml" xmlns:w="http://schemas.openxmlformats.org/wordprocessingml/2006/main" xmlns:w10="urn:schemas-microsoft-com:office:word" xmlns:wp="http://schemas.openxmlformats.org/drawingml/2006/wordprocessingDrawing" xmlns:wps="http://schemas.microsoft.com/office/word/2010/wordprocessingShape" xmlns:wpg="http://schemas.microsoft.com/office/word/2010/wordprocessingGroup" xmlns:mc="http://schemas.openxmlformats.org/markup-compatibility/2006" xmlns:wp14="http://schemas.microsoft.com/office/word/2010/wordprocessingDrawing" xmlns:w14="http://schemas.microsoft.com/office/word/2010/wordml" xmlns:w15="http://schemas.microsoft.com/office/word/2012/wordml" mc:Ignorable="w14 wp14 w15">
+  <w:p>
+    <w:pPr>
+      <w:pStyle w:val="Header"/>
+      <w:rPr/>
+    </w:pPr>
+    <w:r>
+      <w:rPr/>
+    </w:r>
+  </w:p>
+</w:hdr>
+</file>
+
+<file path=word/header2.xml><?xml version="1.0" encoding="utf-8"?>
+<w:hdr xmlns:o="urn:schemas-microsoft-com:office:office" xmlns:r="http://schemas.openxmlformats.org/officeDocument/2006/relationships" xmlns:v="urn:schemas-microsoft-com:vml" xmlns:w="http://schemas.openxmlformats.org/wordprocessingml/2006/main" xmlns:w10="urn:schemas-microsoft-com:office:word" xmlns:wp="http://schemas.openxmlformats.org/drawingml/2006/wordprocessingDrawing" xmlns:wps="http://schemas.microsoft.com/office/word/2010/wordprocessingShape" xmlns:wpg="http://schemas.microsoft.com/office/word/2010/wordprocessingGroup" xmlns:mc="http://schemas.openxmlformats.org/markup-compatibility/2006" xmlns:wp14="http://schemas.microsoft.com/office/word/2010/wordprocessingDrawing" xmlns:w14="http://schemas.microsoft.com/office/word/2010/wordml" xmlns:w15="http://schemas.microsoft.com/office/word/2012/wordml" mc:Ignorable="w14 wp14 w15">
   <w:p>
     <w:pPr>
       <w:pStyle w:val="Header"/>
@@ -2355,18 +2835,18 @@
       <mc:AlternateContent>
         <mc:Choice Requires="wps">
           <w:drawing>
-            <wp:anchor behindDoc="1" distT="0" distB="0" distL="114300" distR="114300" simplePos="0" locked="0" layoutInCell="1" allowOverlap="0" relativeHeight="2" wp14:anchorId="3D704032">
+            <wp:anchor behindDoc="0" distT="0" distB="0" distL="109220" distR="109220" simplePos="0" locked="0" layoutInCell="0" allowOverlap="0" relativeHeight="2" wp14:anchorId="057B0867">
               <wp:simplePos x="0" y="0"/>
               <wp:positionH relativeFrom="page">
                 <wp:posOffset>180340</wp:posOffset>
               </wp:positionH>
               <wp:positionV relativeFrom="page">
-                <wp:posOffset>3780790</wp:posOffset>
+                <wp:posOffset>5347335</wp:posOffset>
               </wp:positionV>
-              <wp:extent cx="184150" cy="1270"/>
-              <wp:effectExtent l="0" t="0" r="0" b="0"/>
+              <wp:extent cx="256540" cy="0"/>
+              <wp:effectExtent l="5080" t="5080" r="5080" b="5080"/>
               <wp:wrapSquare wrapText="bothSides"/>
-              <wp:docPr id="2" name="Line 1"/>
+              <wp:docPr id="2" name="Line 3"/>
               <a:graphic xmlns:a="http://schemas.openxmlformats.org/drawingml/2006/main">
                 <a:graphicData uri="http://schemas.microsoft.com/office/word/2010/wordprocessingShape">
                   <wps:wsp>
@@ -2374,7 +2854,7 @@
                     <wps:spPr>
                       <a:xfrm>
                         <a:off x="0" y="0"/>
-                        <a:ext cx="183600" cy="0"/>
+                        <a:ext cx="256680" cy="0"/>
                       </a:xfrm>
                       <a:prstGeom prst="line">
                         <a:avLst/>
@@ -2401,9 +2881,10 @@
         </mc:Choice>
         <mc:Fallback>
           <w:pict>
-            <v:line id="shape_0" from="14.2pt,297.7pt" to="28.6pt,297.7pt" ID="Line 1" stroked="t" style="position:absolute;mso-position-horizontal-relative:page;mso-position-vertical-relative:page" wp14:anchorId="3D704032">
+            <v:line id="shape_0" from="14.2pt,421.05pt" to="34.35pt,421.05pt" ID="Line 3" stroked="t" o:allowincell="f" style="position:absolute;mso-position-horizontal-relative:page;mso-position-vertical-relative:page" wp14:anchorId="057B0867">
               <v:stroke color="black" weight="9360" joinstyle="round" endcap="flat"/>
               <v:fill o:detectmouseclick="t" on="false"/>
+              <w10:wrap type="square"/>
             </v:line>
           </w:pict>
         </mc:Fallback>
@@ -2411,16 +2892,16 @@
       <mc:AlternateContent>
         <mc:Choice Requires="wps">
           <w:drawing>
-            <wp:anchor behindDoc="1" distT="0" distB="0" distL="114300" distR="114300" simplePos="0" locked="0" layoutInCell="1" allowOverlap="0" relativeHeight="3" wp14:anchorId="3E112C8D">
+            <wp:anchor behindDoc="0" distT="0" distB="0" distL="109220" distR="109220" simplePos="0" locked="0" layoutInCell="0" allowOverlap="0" relativeHeight="3" wp14:anchorId="3E112C8D">
               <wp:simplePos x="0" y="0"/>
               <wp:positionH relativeFrom="page">
                 <wp:posOffset>180340</wp:posOffset>
               </wp:positionH>
               <wp:positionV relativeFrom="page">
-                <wp:posOffset>7560945</wp:posOffset>
+                <wp:posOffset>7561580</wp:posOffset>
               </wp:positionV>
-              <wp:extent cx="184150" cy="1270"/>
-              <wp:effectExtent l="0" t="0" r="0" b="0"/>
+              <wp:extent cx="184150" cy="0"/>
+              <wp:effectExtent l="5080" t="5080" r="5080" b="5080"/>
               <wp:wrapSquare wrapText="bothSides"/>
               <wp:docPr id="3" name="Line 2"/>
               <a:graphic xmlns:a="http://schemas.openxmlformats.org/drawingml/2006/main">
@@ -2430,7 +2911,7 @@
                     <wps:spPr>
                       <a:xfrm>
                         <a:off x="0" y="0"/>
-                        <a:ext cx="183600" cy="0"/>
+                        <a:ext cx="184320" cy="0"/>
                       </a:xfrm>
                       <a:prstGeom prst="line">
                         <a:avLst/>
@@ -2457,9 +2938,10 @@
         </mc:Choice>
         <mc:Fallback>
           <w:pict>
-            <v:line id="shape_0" from="14.2pt,595.35pt" to="28.6pt,595.35pt" ID="Line 2" stroked="t" style="position:absolute;mso-position-horizontal-relative:page;mso-position-vertical-relative:page" wp14:anchorId="3E112C8D">
+            <v:line id="shape_0" from="14.2pt,595.4pt" to="28.65pt,595.4pt" ID="Line 2" stroked="t" o:allowincell="f" style="position:absolute;mso-position-horizontal-relative:page;mso-position-vertical-relative:page" wp14:anchorId="3E112C8D">
               <v:stroke color="black" weight="9360" joinstyle="round" endcap="flat"/>
               <v:fill o:detectmouseclick="t" on="false"/>
+              <w10:wrap type="square"/>
             </v:line>
           </w:pict>
         </mc:Fallback>
@@ -2467,18 +2949,18 @@
       <mc:AlternateContent>
         <mc:Choice Requires="wps">
           <w:drawing>
-            <wp:anchor behindDoc="1" distT="0" distB="0" distL="114300" distR="114300" simplePos="0" locked="0" layoutInCell="1" allowOverlap="0" relativeHeight="4" wp14:anchorId="057B0867">
+            <wp:anchor behindDoc="0" distT="0" distB="0" distL="109220" distR="109220" simplePos="0" locked="0" layoutInCell="0" allowOverlap="0" relativeHeight="6" wp14:anchorId="3D704032">
               <wp:simplePos x="0" y="0"/>
               <wp:positionH relativeFrom="page">
                 <wp:posOffset>180340</wp:posOffset>
               </wp:positionH>
               <wp:positionV relativeFrom="page">
-                <wp:posOffset>5346700</wp:posOffset>
+                <wp:posOffset>3781425</wp:posOffset>
               </wp:positionV>
-              <wp:extent cx="256540" cy="1270"/>
-              <wp:effectExtent l="0" t="0" r="0" b="0"/>
+              <wp:extent cx="184150" cy="0"/>
+              <wp:effectExtent l="5080" t="5080" r="5080" b="5080"/>
               <wp:wrapSquare wrapText="bothSides"/>
-              <wp:docPr id="4" name="Line 3"/>
+              <wp:docPr id="4" name="Line 1"/>
               <a:graphic xmlns:a="http://schemas.openxmlformats.org/drawingml/2006/main">
                 <a:graphicData uri="http://schemas.microsoft.com/office/word/2010/wordprocessingShape">
                   <wps:wsp>
@@ -2486,7 +2968,7 @@
                     <wps:spPr>
                       <a:xfrm>
                         <a:off x="0" y="0"/>
-                        <a:ext cx="255960" cy="0"/>
+                        <a:ext cx="184320" cy="0"/>
                       </a:xfrm>
                       <a:prstGeom prst="line">
                         <a:avLst/>
@@ -2513,9 +2995,195 @@
         </mc:Choice>
         <mc:Fallback>
           <w:pict>
-            <v:line id="shape_0" from="14.2pt,421pt" to="34.3pt,421pt" ID="Line 3" stroked="t" style="position:absolute;mso-position-horizontal-relative:page;mso-position-vertical-relative:page" wp14:anchorId="057B0867">
+            <v:line id="shape_0" from="14.2pt,297.75pt" to="28.65pt,297.75pt" ID="Line 1" stroked="t" o:allowincell="f" style="position:absolute;mso-position-horizontal-relative:page;mso-position-vertical-relative:page" wp14:anchorId="3D704032">
               <v:stroke color="black" weight="9360" joinstyle="round" endcap="flat"/>
               <v:fill o:detectmouseclick="t" on="false"/>
+              <w10:wrap type="square"/>
+            </v:line>
+          </w:pict>
+        </mc:Fallback>
+      </mc:AlternateContent>
+    </w:r>
+  </w:p>
+</w:hdr>
+</file>
+
+<file path=word/header3.xml><?xml version="1.0" encoding="utf-8"?>
+<w:hdr xmlns:o="urn:schemas-microsoft-com:office:office" xmlns:r="http://schemas.openxmlformats.org/officeDocument/2006/relationships" xmlns:v="urn:schemas-microsoft-com:vml" xmlns:w="http://schemas.openxmlformats.org/wordprocessingml/2006/main" xmlns:w10="urn:schemas-microsoft-com:office:word" xmlns:wp="http://schemas.openxmlformats.org/drawingml/2006/wordprocessingDrawing" xmlns:wps="http://schemas.microsoft.com/office/word/2010/wordprocessingShape" xmlns:wpg="http://schemas.microsoft.com/office/word/2010/wordprocessingGroup" xmlns:mc="http://schemas.openxmlformats.org/markup-compatibility/2006" xmlns:wp14="http://schemas.microsoft.com/office/word/2010/wordprocessingDrawing" xmlns:w14="http://schemas.microsoft.com/office/word/2010/wordml" xmlns:w15="http://schemas.microsoft.com/office/word/2012/wordml" mc:Ignorable="w14 wp14 w15">
+  <w:p>
+    <w:pPr>
+      <w:pStyle w:val="Header"/>
+      <w:rPr/>
+    </w:pPr>
+    <w:r>
+      <w:rPr/>
+      <mc:AlternateContent>
+        <mc:Choice Requires="wps">
+          <w:drawing>
+            <wp:anchor behindDoc="0" distT="0" distB="0" distL="109220" distR="109220" simplePos="0" locked="0" layoutInCell="0" allowOverlap="0" relativeHeight="2" wp14:anchorId="057B0867">
+              <wp:simplePos x="0" y="0"/>
+              <wp:positionH relativeFrom="page">
+                <wp:posOffset>180340</wp:posOffset>
+              </wp:positionH>
+              <wp:positionV relativeFrom="page">
+                <wp:posOffset>5347335</wp:posOffset>
+              </wp:positionV>
+              <wp:extent cx="256540" cy="0"/>
+              <wp:effectExtent l="5080" t="5080" r="5080" b="5080"/>
+              <wp:wrapSquare wrapText="bothSides"/>
+              <wp:docPr id="5" name="Line 3"/>
+              <a:graphic xmlns:a="http://schemas.openxmlformats.org/drawingml/2006/main">
+                <a:graphicData uri="http://schemas.microsoft.com/office/word/2010/wordprocessingShape">
+                  <wps:wsp>
+                    <wps:cNvSpPr/>
+                    <wps:spPr>
+                      <a:xfrm>
+                        <a:off x="0" y="0"/>
+                        <a:ext cx="256680" cy="0"/>
+                      </a:xfrm>
+                      <a:prstGeom prst="line">
+                        <a:avLst/>
+                      </a:prstGeom>
+                      <a:ln w="9360">
+                        <a:solidFill>
+                          <a:srgbClr val="000000"/>
+                        </a:solidFill>
+                        <a:round/>
+                      </a:ln>
+                    </wps:spPr>
+                    <wps:style>
+                      <a:lnRef idx="0"/>
+                      <a:fillRef idx="0"/>
+                      <a:effectRef idx="0"/>
+                      <a:fontRef idx="minor"/>
+                    </wps:style>
+                    <wps:bodyPr/>
+                  </wps:wsp>
+                </a:graphicData>
+              </a:graphic>
+            </wp:anchor>
+          </w:drawing>
+        </mc:Choice>
+        <mc:Fallback>
+          <w:pict>
+            <v:line id="shape_0" from="14.2pt,421.05pt" to="34.35pt,421.05pt" ID="Line 3" stroked="t" o:allowincell="f" style="position:absolute;mso-position-horizontal-relative:page;mso-position-vertical-relative:page" wp14:anchorId="057B0867">
+              <v:stroke color="black" weight="9360" joinstyle="round" endcap="flat"/>
+              <v:fill o:detectmouseclick="t" on="false"/>
+              <w10:wrap type="square"/>
+            </v:line>
+          </w:pict>
+        </mc:Fallback>
+      </mc:AlternateContent>
+      <mc:AlternateContent>
+        <mc:Choice Requires="wps">
+          <w:drawing>
+            <wp:anchor behindDoc="0" distT="0" distB="0" distL="109220" distR="109220" simplePos="0" locked="0" layoutInCell="0" allowOverlap="0" relativeHeight="3" wp14:anchorId="3E112C8D">
+              <wp:simplePos x="0" y="0"/>
+              <wp:positionH relativeFrom="page">
+                <wp:posOffset>180340</wp:posOffset>
+              </wp:positionH>
+              <wp:positionV relativeFrom="page">
+                <wp:posOffset>7561580</wp:posOffset>
+              </wp:positionV>
+              <wp:extent cx="184150" cy="0"/>
+              <wp:effectExtent l="5080" t="5080" r="5080" b="5080"/>
+              <wp:wrapSquare wrapText="bothSides"/>
+              <wp:docPr id="6" name="Line 2"/>
+              <a:graphic xmlns:a="http://schemas.openxmlformats.org/drawingml/2006/main">
+                <a:graphicData uri="http://schemas.microsoft.com/office/word/2010/wordprocessingShape">
+                  <wps:wsp>
+                    <wps:cNvSpPr/>
+                    <wps:spPr>
+                      <a:xfrm>
+                        <a:off x="0" y="0"/>
+                        <a:ext cx="184320" cy="0"/>
+                      </a:xfrm>
+                      <a:prstGeom prst="line">
+                        <a:avLst/>
+                      </a:prstGeom>
+                      <a:ln w="9360">
+                        <a:solidFill>
+                          <a:srgbClr val="000000"/>
+                        </a:solidFill>
+                        <a:round/>
+                      </a:ln>
+                    </wps:spPr>
+                    <wps:style>
+                      <a:lnRef idx="0"/>
+                      <a:fillRef idx="0"/>
+                      <a:effectRef idx="0"/>
+                      <a:fontRef idx="minor"/>
+                    </wps:style>
+                    <wps:bodyPr/>
+                  </wps:wsp>
+                </a:graphicData>
+              </a:graphic>
+            </wp:anchor>
+          </w:drawing>
+        </mc:Choice>
+        <mc:Fallback>
+          <w:pict>
+            <v:line id="shape_0" from="14.2pt,595.4pt" to="28.65pt,595.4pt" ID="Line 2" stroked="t" o:allowincell="f" style="position:absolute;mso-position-horizontal-relative:page;mso-position-vertical-relative:page" wp14:anchorId="3E112C8D">
+              <v:stroke color="black" weight="9360" joinstyle="round" endcap="flat"/>
+              <v:fill o:detectmouseclick="t" on="false"/>
+              <w10:wrap type="square"/>
+            </v:line>
+          </w:pict>
+        </mc:Fallback>
+      </mc:AlternateContent>
+      <mc:AlternateContent>
+        <mc:Choice Requires="wps">
+          <w:drawing>
+            <wp:anchor behindDoc="0" distT="0" distB="0" distL="109220" distR="109220" simplePos="0" locked="0" layoutInCell="0" allowOverlap="0" relativeHeight="6" wp14:anchorId="3D704032">
+              <wp:simplePos x="0" y="0"/>
+              <wp:positionH relativeFrom="page">
+                <wp:posOffset>180340</wp:posOffset>
+              </wp:positionH>
+              <wp:positionV relativeFrom="page">
+                <wp:posOffset>3781425</wp:posOffset>
+              </wp:positionV>
+              <wp:extent cx="184150" cy="0"/>
+              <wp:effectExtent l="5080" t="5080" r="5080" b="5080"/>
+              <wp:wrapSquare wrapText="bothSides"/>
+              <wp:docPr id="7" name="Line 1"/>
+              <a:graphic xmlns:a="http://schemas.openxmlformats.org/drawingml/2006/main">
+                <a:graphicData uri="http://schemas.microsoft.com/office/word/2010/wordprocessingShape">
+                  <wps:wsp>
+                    <wps:cNvSpPr/>
+                    <wps:spPr>
+                      <a:xfrm>
+                        <a:off x="0" y="0"/>
+                        <a:ext cx="184320" cy="0"/>
+                      </a:xfrm>
+                      <a:prstGeom prst="line">
+                        <a:avLst/>
+                      </a:prstGeom>
+                      <a:ln w="9360">
+                        <a:solidFill>
+                          <a:srgbClr val="000000"/>
+                        </a:solidFill>
+                        <a:round/>
+                      </a:ln>
+                    </wps:spPr>
+                    <wps:style>
+                      <a:lnRef idx="0"/>
+                      <a:fillRef idx="0"/>
+                      <a:effectRef idx="0"/>
+                      <a:fontRef idx="minor"/>
+                    </wps:style>
+                    <wps:bodyPr/>
+                  </wps:wsp>
+                </a:graphicData>
+              </a:graphic>
+            </wp:anchor>
+          </w:drawing>
+        </mc:Choice>
+        <mc:Fallback>
+          <w:pict>
+            <v:line id="shape_0" from="14.2pt,297.75pt" to="28.65pt,297.75pt" ID="Line 1" stroked="t" o:allowincell="f" style="position:absolute;mso-position-horizontal-relative:page;mso-position-vertical-relative:page" wp14:anchorId="3D704032">
+              <v:stroke color="black" weight="9360" joinstyle="round" endcap="flat"/>
+              <v:fill o:detectmouseclick="t" on="false"/>
+              <w10:wrap type="square"/>
             </v:line>
           </w:pict>
         </mc:Fallback>
@@ -2828,7 +3496,7 @@
     <w:pPr>
       <w:widowControl/>
       <w:suppressAutoHyphens w:val="true"/>
-      <w:overflowPunct w:val="true"/>
+      <w:overflowPunct w:val="false"/>
       <w:bidi w:val="0"/>
       <w:spacing w:before="0" w:after="0"/>
       <w:jc w:val="left"/>
@@ -2867,7 +3535,7 @@
     <w:pPr>
       <w:keepNext w:val="true"/>
       <w:spacing w:lineRule="atLeast" w:line="240" w:before="240" w:after="0"/>
-      <w:ind w:left="709" w:hanging="0"/>
+      <w:ind w:hanging="0" w:left="709"/>
       <w:jc w:val="right"/>
       <w:outlineLvl w:val="1"/>
     </w:pPr>
@@ -2882,7 +3550,7 @@
     <w:qFormat/>
     <w:pPr>
       <w:keepNext w:val="true"/>
-      <w:ind w:right="-3" w:hanging="0"/>
+      <w:ind w:hanging="0" w:right="-3"/>
       <w:outlineLvl w:val="2"/>
     </w:pPr>
     <w:rPr>
@@ -2913,7 +3581,7 @@
     <w:qFormat/>
     <w:rPr/>
   </w:style>
-  <w:style w:type="character" w:styleId="InternetLink">
+  <w:style w:type="character" w:styleId="Hyperlink">
     <w:name w:val="Hyperlink"/>
     <w:rsid w:val="00ae7ed7"/>
     <w:rPr>
@@ -2936,7 +3604,6 @@
   <w:style w:type="character" w:styleId="KopfzeileZchn" w:customStyle="1">
     <w:name w:val="Kopfzeile Zchn"/>
     <w:basedOn w:val="DefaultParagraphFont"/>
-    <w:link w:val="Kopfzeile"/>
     <w:qFormat/>
     <w:rsid w:val="008c19db"/>
     <w:rPr>
@@ -2947,7 +3614,7 @@
   <w:style w:type="paragraph" w:styleId="Heading">
     <w:name w:val="Heading"/>
     <w:basedOn w:val="Normal"/>
-    <w:next w:val="TextBody"/>
+    <w:next w:val="BodyText"/>
     <w:qFormat/>
     <w:pPr>
       <w:keepNext w:val="true"/>
@@ -2959,7 +3626,7 @@
       <w:szCs w:val="28"/>
     </w:rPr>
   </w:style>
-  <w:style w:type="paragraph" w:styleId="TextBody">
+  <w:style w:type="paragraph" w:styleId="BodyText">
     <w:name w:val="Body Text"/>
     <w:basedOn w:val="Normal"/>
     <w:pPr>
@@ -2969,7 +3636,7 @@
   </w:style>
   <w:style w:type="paragraph" w:styleId="List">
     <w:name w:val="List"/>
-    <w:basedOn w:val="TextBody"/>
+    <w:basedOn w:val="BodyText"/>
     <w:pPr/>
     <w:rPr>
       <w:rFonts w:cs="Lohit Devanagari"/>
@@ -3014,7 +3681,7 @@
         <w:tab w:val="left" w:pos="7200" w:leader="none"/>
       </w:tabs>
       <w:spacing w:before="240" w:after="0"/>
-      <w:ind w:left="7200" w:hanging="7200"/>
+      <w:ind w:hanging="7200" w:left="7200"/>
     </w:pPr>
     <w:rPr>
       <w:rFonts w:ascii="Courier New" w:hAnsi="Courier New"/>
@@ -3098,7 +3765,6 @@
     <w:semiHidden/>
     <w:unhideWhenUsed/>
     <w:tblPr>
-      <w:tblInd w:w="0" w:type="dxa"/>
       <w:tblCellMar>
         <w:top w:w="0" w:type="dxa"/>
         <w:left w:w="108" w:type="dxa"/>
@@ -3141,195 +3807,97 @@
 </file>
 
 <file path=word/theme/theme1.xml><?xml version="1.0" encoding="utf-8"?>
-<a:theme xmlns:a="http://schemas.openxmlformats.org/drawingml/2006/main" name="Office">
+<a:theme xmlns:a="http://schemas.openxmlformats.org/drawingml/2006/main" xmlns:r="http://schemas.openxmlformats.org/officeDocument/2006/relationships" name="Office">
   <a:themeElements>
     <a:clrScheme name="Office">
       <a:dk1>
-        <a:sysClr val="windowText" lastClr="000000"/>
+        <a:srgbClr val="000000"/>
       </a:dk1>
       <a:lt1>
-        <a:sysClr val="window" lastClr="FFFFFF"/>
+        <a:srgbClr val="ffffff"/>
       </a:lt1>
       <a:dk2>
-        <a:srgbClr val="44546A"/>
+        <a:srgbClr val="44546a"/>
       </a:dk2>
       <a:lt2>
-        <a:srgbClr val="E7E6E6"/>
+        <a:srgbClr val="e7e6e6"/>
       </a:lt2>
       <a:accent1>
-        <a:srgbClr val="4472C4"/>
+        <a:srgbClr val="4472c4"/>
       </a:accent1>
       <a:accent2>
-        <a:srgbClr val="ED7D31"/>
+        <a:srgbClr val="ed7d31"/>
       </a:accent2>
       <a:accent3>
-        <a:srgbClr val="A5A5A5"/>
+        <a:srgbClr val="a5a5a5"/>
       </a:accent3>
       <a:accent4>
-        <a:srgbClr val="FFC000"/>
+        <a:srgbClr val="ffc000"/>
       </a:accent4>
       <a:accent5>
-        <a:srgbClr val="5B9BD5"/>
+        <a:srgbClr val="5b9bd5"/>
       </a:accent5>
       <a:accent6>
-        <a:srgbClr val="70AD47"/>
+        <a:srgbClr val="70ad47"/>
       </a:accent6>
       <a:hlink>
-        <a:srgbClr val="0563C1"/>
+        <a:srgbClr val="0563c1"/>
       </a:hlink>
       <a:folHlink>
-        <a:srgbClr val="954F72"/>
+        <a:srgbClr val="954f72"/>
       </a:folHlink>
     </a:clrScheme>
     <a:fontScheme name="Office">
       <a:majorFont>
-        <a:latin typeface="Calibri Light" panose="020F0302020204030204"/>
+        <a:latin typeface="Calibri Light" panose="020F0302020204030204" pitchFamily="0" charset="1"/>
         <a:ea typeface=""/>
         <a:cs typeface=""/>
-        <a:font script="Jpan" typeface="游ゴシック Light"/>
-        <a:font script="Hang" typeface="맑은 고딕"/>
-        <a:font script="Hans" typeface="等线 Light"/>
-        <a:font script="Hant" typeface="新細明體"/>
-        <a:font script="Arab" typeface="Times New Roman"/>
-        <a:font script="Hebr" typeface="Times New Roman"/>
-        <a:font script="Thai" typeface="Angsana New"/>
-        <a:font script="Ethi" typeface="Nyala"/>
-        <a:font script="Beng" typeface="Vrinda"/>
-        <a:font script="Gujr" typeface="Shruti"/>
-        <a:font script="Khmr" typeface="MoolBoran"/>
-        <a:font script="Knda" typeface="Tunga"/>
-        <a:font script="Guru" typeface="Raavi"/>
-        <a:font script="Cans" typeface="Euphemia"/>
-        <a:font script="Cher" typeface="Plantagenet Cherokee"/>
-        <a:font script="Yiii" typeface="Microsoft Yi Baiti"/>
-        <a:font script="Tibt" typeface="Microsoft Himalaya"/>
-        <a:font script="Thaa" typeface="MV Boli"/>
-        <a:font script="Deva" typeface="Mangal"/>
-        <a:font script="Telu" typeface="Gautami"/>
-        <a:font script="Taml" typeface="Latha"/>
-        <a:font script="Syrc" typeface="Estrangelo Edessa"/>
-        <a:font script="Orya" typeface="Kalinga"/>
-        <a:font script="Mlym" typeface="Kartika"/>
-        <a:font script="Laoo" typeface="DokChampa"/>
-        <a:font script="Sinh" typeface="Iskoola Pota"/>
-        <a:font script="Mong" typeface="Mongolian Baiti"/>
-        <a:font script="Viet" typeface="Times New Roman"/>
-        <a:font script="Uigh" typeface="Microsoft Uighur"/>
-        <a:font script="Geor" typeface="Sylfaen"/>
-        <a:font script="Armn" typeface="Arial"/>
-        <a:font script="Bugi" typeface="Leelawadee UI"/>
-        <a:font script="Bopo" typeface="Microsoft JhengHei"/>
-        <a:font script="Java" typeface="Javanese Text"/>
-        <a:font script="Lisu" typeface="Segoe UI"/>
-        <a:font script="Mymr" typeface="Myanmar Text"/>
-        <a:font script="Nkoo" typeface="Ebrima"/>
-        <a:font script="Olck" typeface="Nirmala UI"/>
-        <a:font script="Osma" typeface="Ebrima"/>
-        <a:font script="Phag" typeface="Phagspa"/>
-        <a:font script="Syrn" typeface="Estrangelo Edessa"/>
-        <a:font script="Syrj" typeface="Estrangelo Edessa"/>
-        <a:font script="Syre" typeface="Estrangelo Edessa"/>
-        <a:font script="Sora" typeface="Nirmala UI"/>
-        <a:font script="Tale" typeface="Microsoft Tai Le"/>
-        <a:font script="Talu" typeface="Microsoft New Tai Lue"/>
-        <a:font script="Tfng" typeface="Ebrima"/>
       </a:majorFont>
       <a:minorFont>
-        <a:latin typeface="Calibri" panose="020F0502020204030204"/>
+        <a:latin typeface="Calibri" panose="020F0502020204030204" pitchFamily="0" charset="1"/>
         <a:ea typeface=""/>
         <a:cs typeface=""/>
-        <a:font script="Jpan" typeface="游明朝"/>
-        <a:font script="Hang" typeface="맑은 고딕"/>
-        <a:font script="Hans" typeface="等线"/>
-        <a:font script="Hant" typeface="新細明體"/>
-        <a:font script="Arab" typeface="Arial"/>
-        <a:font script="Hebr" typeface="Arial"/>
-        <a:font script="Thai" typeface="Cordia New"/>
-        <a:font script="Ethi" typeface="Nyala"/>
-        <a:font script="Beng" typeface="Vrinda"/>
-        <a:font script="Gujr" typeface="Shruti"/>
-        <a:font script="Khmr" typeface="DaunPenh"/>
-        <a:font script="Knda" typeface="Tunga"/>
-        <a:font script="Guru" typeface="Raavi"/>
-        <a:font script="Cans" typeface="Euphemia"/>
-        <a:font script="Cher" typeface="Plantagenet Cherokee"/>
-        <a:font script="Yiii" typeface="Microsoft Yi Baiti"/>
-        <a:font script="Tibt" typeface="Microsoft Himalaya"/>
-        <a:font script="Thaa" typeface="MV Boli"/>
-        <a:font script="Deva" typeface="Mangal"/>
-        <a:font script="Telu" typeface="Gautami"/>
-        <a:font script="Taml" typeface="Latha"/>
-        <a:font script="Syrc" typeface="Estrangelo Edessa"/>
-        <a:font script="Orya" typeface="Kalinga"/>
-        <a:font script="Mlym" typeface="Kartika"/>
-        <a:font script="Laoo" typeface="DokChampa"/>
-        <a:font script="Sinh" typeface="Iskoola Pota"/>
-        <a:font script="Mong" typeface="Mongolian Baiti"/>
-        <a:font script="Viet" typeface="Arial"/>
-        <a:font script="Uigh" typeface="Microsoft Uighur"/>
-        <a:font script="Geor" typeface="Sylfaen"/>
-        <a:font script="Armn" typeface="Arial"/>
-        <a:font script="Bugi" typeface="Leelawadee UI"/>
-        <a:font script="Bopo" typeface="Microsoft JhengHei"/>
-        <a:font script="Java" typeface="Javanese Text"/>
-        <a:font script="Lisu" typeface="Segoe UI"/>
-        <a:font script="Mymr" typeface="Myanmar Text"/>
-        <a:font script="Nkoo" typeface="Ebrima"/>
-        <a:font script="Olck" typeface="Nirmala UI"/>
-        <a:font script="Osma" typeface="Ebrima"/>
-        <a:font script="Phag" typeface="Phagspa"/>
-        <a:font script="Syrn" typeface="Estrangelo Edessa"/>
-        <a:font script="Syrj" typeface="Estrangelo Edessa"/>
-        <a:font script="Syre" typeface="Estrangelo Edessa"/>
-        <a:font script="Sora" typeface="Nirmala UI"/>
-        <a:font script="Tale" typeface="Microsoft Tai Le"/>
-        <a:font script="Talu" typeface="Microsoft New Tai Lue"/>
-        <a:font script="Tfng" typeface="Ebrima"/>
       </a:minorFont>
     </a:fontScheme>
-    <a:fmtScheme name="Office">
+    <a:fmtScheme>
       <a:fillStyleLst>
         <a:solidFill>
           <a:schemeClr val="phClr"/>
         </a:solidFill>
-        <a:gradFill rotWithShape="1">
+        <a:gradFill>
           <a:gsLst>
             <a:gs pos="0">
               <a:schemeClr val="phClr">
                 <a:lumMod val="110000"/>
-                <a:satMod val="105000"/>
                 <a:tint val="67000"/>
               </a:schemeClr>
             </a:gs>
             <a:gs pos="50000">
               <a:schemeClr val="phClr">
                 <a:lumMod val="105000"/>
-                <a:satMod val="103000"/>
                 <a:tint val="73000"/>
               </a:schemeClr>
             </a:gs>
             <a:gs pos="100000">
               <a:schemeClr val="phClr">
                 <a:lumMod val="105000"/>
-                <a:satMod val="109000"/>
                 <a:tint val="81000"/>
               </a:schemeClr>
             </a:gs>
           </a:gsLst>
           <a:lin ang="5400000" scaled="0"/>
+          <a:tileRect l="0" t="0" r="0" b="0"/>
         </a:gradFill>
-        <a:gradFill rotWithShape="1">
+        <a:gradFill>
           <a:gsLst>
             <a:gs pos="0">
               <a:schemeClr val="phClr">
-                <a:satMod val="103000"/>
                 <a:lumMod val="102000"/>
                 <a:tint val="94000"/>
               </a:schemeClr>
             </a:gs>
             <a:gs pos="50000">
               <a:schemeClr val="phClr">
-                <a:satMod val="110000"/>
                 <a:lumMod val="100000"/>
                 <a:shade val="100000"/>
               </a:schemeClr>
@@ -3337,33 +3905,24 @@
             <a:gs pos="100000">
               <a:schemeClr val="phClr">
                 <a:lumMod val="99000"/>
-                <a:satMod val="120000"/>
                 <a:shade val="78000"/>
               </a:schemeClr>
             </a:gs>
           </a:gsLst>
           <a:lin ang="5400000" scaled="0"/>
+          <a:tileRect l="0" t="0" r="0" b="0"/>
         </a:gradFill>
       </a:fillStyleLst>
       <a:lnStyleLst>
         <a:ln w="6350" cap="flat" cmpd="sng" algn="ctr">
-          <a:solidFill>
-            <a:schemeClr val="phClr"/>
-          </a:solidFill>
           <a:prstDash val="solid"/>
           <a:miter lim="800000"/>
         </a:ln>
         <a:ln w="12700" cap="flat" cmpd="sng" algn="ctr">
-          <a:solidFill>
-            <a:schemeClr val="phClr"/>
-          </a:solidFill>
           <a:prstDash val="solid"/>
           <a:miter lim="800000"/>
         </a:ln>
         <a:ln w="19050" cap="flat" cmpd="sng" algn="ctr">
-          <a:solidFill>
-            <a:schemeClr val="phClr"/>
-          </a:solidFill>
           <a:prstDash val="solid"/>
           <a:miter lim="800000"/>
         </a:ln>
@@ -3376,13 +3935,7 @@
           <a:effectLst/>
         </a:effectStyle>
         <a:effectStyle>
-          <a:effectLst>
-            <a:outerShdw blurRad="57150" dist="19050" dir="5400000" algn="ctr" rotWithShape="0">
-              <a:srgbClr val="000000">
-                <a:alpha val="63000"/>
-              </a:srgbClr>
-            </a:outerShdw>
-          </a:effectLst>
+          <a:effectLst/>
         </a:effectStyle>
       </a:effectStyleLst>
       <a:bgFillStyleLst>
@@ -3392,15 +3945,13 @@
         <a:solidFill>
           <a:schemeClr val="phClr">
             <a:tint val="95000"/>
-            <a:satMod val="170000"/>
           </a:schemeClr>
         </a:solidFill>
-        <a:gradFill rotWithShape="1">
+        <a:gradFill>
           <a:gsLst>
             <a:gs pos="0">
               <a:schemeClr val="phClr">
                 <a:tint val="93000"/>
-                <a:satMod val="150000"/>
                 <a:shade val="98000"/>
                 <a:lumMod val="102000"/>
               </a:schemeClr>
@@ -3408,7 +3959,6 @@
             <a:gs pos="50000">
               <a:schemeClr val="phClr">
                 <a:tint val="98000"/>
-                <a:satMod val="130000"/>
                 <a:shade val="90000"/>
                 <a:lumMod val="103000"/>
               </a:schemeClr>
@@ -3416,22 +3966,15 @@
             <a:gs pos="100000">
               <a:schemeClr val="phClr">
                 <a:shade val="63000"/>
-                <a:satMod val="120000"/>
               </a:schemeClr>
             </a:gs>
           </a:gsLst>
           <a:lin ang="5400000" scaled="0"/>
+          <a:tileRect l="0" t="0" r="0" b="0"/>
         </a:gradFill>
       </a:bgFillStyleLst>
     </a:fmtScheme>
   </a:themeElements>
-  <a:objectDefaults/>
-  <a:extraClrSchemeLst/>
-  <a:extLst>
-    <a:ext uri="{05A4C25C-085E-4340-85A3-A5531E510DB2}">
-      <thm15:themeFamily xmlns:thm15="http://schemas.microsoft.com/office/thememl/2012/main" name="Office Theme" id="{62F939B6-93AF-4DB8-9C6B-D6C7DFDC589F}" vid="{4A3C46E8-61CC-4603-A589-7422A47A8E4A}"/>
-    </a:ext>
-  </a:extLst>
 </a:theme>
 </file>
 

</xml_diff>